<commit_message>
Añade el diagrama de arquitectura y flujo de las IA al manual
Diagrama propio generado con PIL (sin dependencias nuevas) en tres capas:

- Capa 1 · Navegador: las cuatro vistas que consumen IA.
- Capa 2 · Backend: los seis módulos en tarjetas con su algoritmo, más la
  franja de servicios transversales (proveedor, telemetría, conocimiento y
  configuración) y la nota de degradación al motor local.
- Capa 3 · PostgreSQL + pgvector con los seis dominios de tablas.
- Dos proveedores externos con sus flechas diferenciadas: el LLM por HTTPS con
  Bearer token y el sidecar de embeddings por HTTP local.

Se incrusta con pie de figura y se añade el apartado "Cómo leer el diagrama",
que explica qué significa cada capa y de qué proveedor depende cada módulo.

Generador en docs/generar_diagrama_ia.py, separado del documento para poder
regenerarlo o ajustarlo sin tocar el manual.
</commit_message>
<xml_diff>
--- a/docs/Manual_Integracion_y_Demostracion_IA_VivaModa.docx
+++ b/docs/Manual_Integracion_y_Demostracion_IA_VivaModa.docx
@@ -294,6 +294,142 @@
       <w:pPr>
         <w:spacing w:after="60"/>
       </w:pPr>
+    </w:p>
+    <w:p>
+      <w:pPr>
+        <w:pStyle w:val="Heading2"/>
+      </w:pPr>
+      <w:r>
+        <w:t>Diagrama de arquitectura y flujo</w:t>
+      </w:r>
+    </w:p>
+    <w:p>
+      <w:pPr>
+        <w:spacing w:after="100" w:before="0"/>
+      </w:pPr>
+      <w:r>
+        <w:rPr>
+          <w:b w:val="0"/>
+          <w:i w:val="0"/>
+          <w:color w:val="1C1B1D"/>
+          <w:sz w:val="21"/>
+        </w:rPr>
+        <w:t>El diagrama siguiente muestra las tres capas del sistema, los seis módulos de IA dentro del backend, los servicios que comparten y los dos proveedores externos a los que se conectan.</w:t>
+      </w:r>
+    </w:p>
+    <w:p>
+      <w:pPr>
+        <w:jc w:val="center"/>
+      </w:pPr>
+      <w:r>
+        <w:drawing>
+          <wp:inline xmlns:a="http://schemas.openxmlformats.org/drawingml/2006/main" xmlns:pic="http://schemas.openxmlformats.org/drawingml/2006/picture">
+            <wp:extent cx="6217920" cy="4516173"/>
+            <wp:docPr id="1" name="Picture 1"/>
+            <wp:cNvGraphicFramePr>
+              <a:graphicFrameLocks noChangeAspect="1"/>
+            </wp:cNvGraphicFramePr>
+            <a:graphic>
+              <a:graphicData uri="http://schemas.openxmlformats.org/drawingml/2006/picture">
+                <pic:pic>
+                  <pic:nvPicPr>
+                    <pic:cNvPr id="0" name="diagrama_arquitectura_ia.png"/>
+                    <pic:cNvPicPr/>
+                  </pic:nvPicPr>
+                  <pic:blipFill>
+                    <a:blip r:embed="rId9"/>
+                    <a:stretch>
+                      <a:fillRect/>
+                    </a:stretch>
+                  </pic:blipFill>
+                  <pic:spPr>
+                    <a:xfrm>
+                      <a:off x="0" y="0"/>
+                      <a:ext cx="6217920" cy="4516173"/>
+                    </a:xfrm>
+                    <a:prstGeom prst="rect"/>
+                  </pic:spPr>
+                </pic:pic>
+              </a:graphicData>
+            </a:graphic>
+          </wp:inline>
+        </w:drawing>
+      </w:r>
+    </w:p>
+    <w:p>
+      <w:pPr>
+        <w:spacing w:after="200" w:before="0"/>
+        <w:jc w:val="center"/>
+      </w:pPr>
+      <w:r>
+        <w:rPr>
+          <w:b w:val="0"/>
+          <w:i/>
+          <w:color w:val="5C3F45"/>
+          <w:sz w:val="18"/>
+        </w:rPr>
+        <w:t>Figura 1. Arquitectura y flujo de las seis IA. Las flechas indican el sentido de las peticiones: del navegador al backend, y de este a los proveedores y a la base de datos.</w:t>
+      </w:r>
+    </w:p>
+    <w:p>
+      <w:pPr>
+        <w:pStyle w:val="Heading2"/>
+      </w:pPr>
+      <w:r>
+        <w:t>Cómo leer el diagrama</w:t>
+      </w:r>
+    </w:p>
+    <w:p>
+      <w:pPr>
+        <w:pStyle w:val="ListBullet"/>
+        <w:spacing w:after="40"/>
+      </w:pPr>
+      <w:r>
+        <w:rPr>
+          <w:rFonts w:ascii="Calibri" w:hAnsi="Calibri"/>
+          <w:sz w:val="21"/>
+        </w:rPr>
+        <w:t>Capa 1 — Navegador: las cuatro vistas que consumen IA. Ninguna habla directamente con un proveedor; todas pasan por el backend con su token de sesión.</w:t>
+      </w:r>
+    </w:p>
+    <w:p>
+      <w:pPr>
+        <w:pStyle w:val="ListBullet"/>
+        <w:spacing w:after="40"/>
+      </w:pPr>
+      <w:r>
+        <w:rPr>
+          <w:rFonts w:ascii="Calibri" w:hAnsi="Calibri"/>
+          <w:sz w:val="21"/>
+        </w:rPr>
+        <w:t>Capa 2 — Backend: aloja los seis módulos y los servicios transversales. Las líneas que los unen indican que comparten proveedor, telemetría, conocimiento y configuración.</w:t>
+      </w:r>
+    </w:p>
+    <w:p>
+      <w:pPr>
+        <w:pStyle w:val="ListBullet"/>
+        <w:spacing w:after="40"/>
+      </w:pPr>
+      <w:r>
+        <w:rPr>
+          <w:rFonts w:ascii="Calibri" w:hAnsi="Calibri"/>
+          <w:sz w:val="21"/>
+        </w:rPr>
+        <w:t>Capa 3 — Datos: PostgreSQL cumple doble función, base relacional y almacén vectorial. Es la razón de que no haya un motor vectorial separado.</w:t>
+      </w:r>
+    </w:p>
+    <w:p>
+      <w:pPr>
+        <w:pStyle w:val="ListBullet"/>
+        <w:spacing w:after="40"/>
+      </w:pPr>
+      <w:r>
+        <w:rPr>
+          <w:rFonts w:ascii="Calibri" w:hAnsi="Calibri"/>
+          <w:sz w:val="21"/>
+        </w:rPr>
+        <w:t>Proveedores: el LLM externo aporta el lenguaje; el sidecar local aporta la comprensión visual sin coste por consulta. Los módulos 2, 3 y 6 dependen del sidecar; el resto, del LLM.</w:t>
+      </w:r>
     </w:p>
     <w:p>
       <w:pPr>

</xml_diff>